<commit_message>
docs(pre-discovery): fill in 'why now' with 4K alerts/min and bottom-up sponsorship
Replaces the two [FILL IN] placeholders in §1 with the real signals: an
alerting pipeline ingesting ~4,000 alerts/minute (~5.7M/day) — which makes
manual triage structurally infeasible and is the load-bearing fact for the
project — and a bottom-up initiative with manager-level sponsorship,
laddering into operational-excellence themes rather than a formal OKR.

Also surfaces the 4K/min figure in §4 Supporting Data as one already-known
datapoint, with the rest still to be measured during discovery.
</commit_message>
<xml_diff>
--- a/docs/alert-automation-pre-discovery.docx
+++ b/docs/alert-automation-pre-discovery.docx
@@ -87,13 +87,21 @@
       </w:pPr>
       <w:r>
         <w:rPr>
-          <w:rFonts w:ascii="Consolas" w:hAnsi="Consolas"/>
-          <w:sz w:val="20"/>
+          <w:b/>
         </w:rPr>
-        <w:t>[FILL IN]</w:t>
+        <w:t>Alert volume.</w:t>
       </w:r>
       <w:r>
-        <w:t xml:space="preserve"> Recent trend in alert volume / paging frequency that triggered the initiative.</w:t>
+        <w:t xml:space="preserve"> Our alerting pipeline ingests roughly </w:t>
+      </w:r>
+      <w:r>
+        <w:rPr>
+          <w:b/>
+        </w:rPr>
+        <w:t>4,000 alerts/minute</w:t>
+      </w:r>
+      <w:r>
+        <w:t xml:space="preserve"> (~240K/hour, ~5.7M/day). At this volume, manual triage is structurally infeasible — there is no headcount answer. Encoding the existing manual runbooks as automated workflows is the only realistic path to keep up; the human-paging slice and the top-N contributing alert classes are quantified during discovery (see §4).</w:t>
       </w:r>
     </w:p>
     <w:p>
@@ -102,13 +110,12 @@
       </w:pPr>
       <w:r>
         <w:rPr>
-          <w:rFonts w:ascii="Consolas" w:hAnsi="Consolas"/>
-          <w:sz w:val="20"/>
+          <w:b/>
         </w:rPr>
-        <w:t>[FILL IN]</w:t>
+        <w:t>Strategic alignment.</w:t>
       </w:r>
       <w:r>
-        <w:t xml:space="preserve"> Strategic context — does this slot under an SRE / Reliability OKR for the year?</w:t>
+        <w:t xml:space="preserve"> Bottom-up initiative raised by the platform group, with manager-level sponsorship in place. Not currently mapped to a top-level SRE/Reliability OKR; ladders into the org's operational-excellence themes — reducing on-call toil, codifying tribal knowledge, and unblocking application teams from platform-team capacity. Formal OKR placement is itself a discovery deliverable: either propose this as a contributor to an existing reliability OKR or stand up a dedicated key result.</w:t>
       </w:r>
     </w:p>
     <w:p>
@@ -369,10 +376,10 @@
     <w:p>
       <w:r>
         <w:rPr>
-          <w:rFonts w:ascii="Consolas" w:hAnsi="Consolas"/>
-          <w:sz w:val="20"/>
+          <w:b/>
+          <w:i w:val="0"/>
         </w:rPr>
-        <w:t>[FILL IN — needs measurement and / or a pull from existing tooling. Suggested baseline:]</w:t>
+        <w:t>Known today:</w:t>
       </w:r>
     </w:p>
     <w:p>
@@ -380,7 +387,30 @@
         <w:pStyle w:val="ListBullet"/>
       </w:pPr>
       <w:r>
-        <w:t>Current alert volume per team per week (Datadog / Prometheus).</w:t>
+        <w:rPr>
+          <w:b/>
+        </w:rPr>
+        <w:t>Alerting-pipeline ingest rate: ~4,000 alerts/minute</w:t>
+      </w:r>
+      <w:r>
+        <w:t xml:space="preserve"> (~240K/hour, ~5.7M/day) across the platforms in scope. This volume alone defeats any human-triage strategy and is the load-bearing fact for the project.</w:t>
+      </w:r>
+    </w:p>
+    <w:p>
+      <w:r>
+        <w:rPr>
+          <w:b/>
+          <w:i w:val="0"/>
+        </w:rPr>
+        <w:t>To be measured during discovery:</w:t>
+      </w:r>
+    </w:p>
+    <w:p>
+      <w:pPr>
+        <w:pStyle w:val="ListBullet"/>
+      </w:pPr>
+      <w:r>
+        <w:t>The human-paging slice of the 4K/min figure (post-dedup, post-correlation, post-routing) — this is the slice workflows actually act on.</w:t>
       </w:r>
     </w:p>
     <w:p>

</xml_diff>